<commit_message>
Document paired self-play, symmetry-breaking investigation, new reward terms
Covers the mirror-equivariance investigation (8 eliminated hypotheses),
balance/ground/knee reward terms, the paired self-play architecture
(PairedSelfPlayVecEnv), two logging bugs found in it, and the final
finding that the a/b asymmetry persists even there after full
convergence -- likely spontaneous symmetry breaking, not a bug.

Co-Authored-By: Claude Sonnet 5 <noreply@anthropic.com>
</commit_message>
<xml_diff>
--- a/docs/fightai_기술문서.docx
+++ b/docs/fightai_기술문서.docx
@@ -347,6 +347,57 @@
     </w:p>
     <w:p>
       <w:pPr>
+        <w:pStyle w:val="Heading2"/>
+      </w:pPr>
+      <w:r>
+        <w:t>2.10 진짜 동시 셀프플레이 (scripts/selfplay_vec_env.py, train_selfplay_paired.py)</w:t>
+      </w:r>
+    </w:p>
+    <w:p>
+      <w:r>
+        <w:rPr>
+          <w:b w:val="0"/>
+          <w:i w:val="0"/>
+        </w:rPr>
+        <w:t>기존 train_selfplay.py 방식은 'a'만 계속 그래디언트로 학습되고 'b'는 주기적으로 갱신되는 얼려진 스냅샷이었다. 이 구조 자체가 'a'는 항상 지금 막 탐험 중이고 'b'는 탐험이 멈춘 과거 시점이라는 비대칭을 내재하고 있다는 게 4절의 조사로 드러나면서, 'b'도 얼리지 않고 매 스텝 같은 살아있는 정책으로 직접 플레이하게 만드는 진짜 동시 셀프플레이 구조를 새로 구현했다.</w:t>
+      </w:r>
+    </w:p>
+    <w:p>
+      <w:r>
+        <w:rPr>
+          <w:b w:val="0"/>
+          <w:i w:val="0"/>
+        </w:rPr>
+        <w:t>PairedSelfPlayVecEnv는 N개의 물리 MuJoCo 시뮬레이션(워커 서브프로세스)을 SB3에는 2N개의 학습 슬롯으로 노출한다 — 슬롯 2i는 물리 환경 i의 'a' 시점, 슬롯 2i+1은 같은 매치의 'b' 시점. 매 스텝 물리는 한 번만 진행되고(env.step()에 새로 추가한 b_full_action 파라미터로 'b'의 행동을 외부에서 직접 주입), 양쪽 시점의 (관측, 행동, 보상) 전부가 같은 PPO 롤아웃 버퍼에 들어가 같은 정책을 업데이트한다. 더 이상 상대 스냅샷 갱신이라는 개념 자체가 없다 — 'b'가 항상 정확히 지금 이 순간의 'a'이기 때문이다.</w:t>
+      </w:r>
+    </w:p>
+    <w:p>
+      <w:r>
+        <w:rPr>
+          <w:b w:val="0"/>
+          <w:i w:val="0"/>
+        </w:rPr>
+        <w:t>구현 중 두 가지 순수 로깅 버그를 발견해 수정했다 (둘 다 학습 자체엔 영향 없음, 모니터링만 왜곡됨):</w:t>
+      </w:r>
+    </w:p>
+    <w:p>
+      <w:pPr>
+        <w:pStyle w:val="ListBullet"/>
+      </w:pPr>
+      <w:r>
+        <w:t>SB3가 기대하는 info["episode"] 키를 채워주지 않아 ep_rew_mean/ep_len_mean이 갱신되지 않고 고정값만 반복 출력됨 — Monitor 래퍼와 동등한 에피소드 리턴/길이 추적을 워커에 직접 구현해 해결.</w:t>
+      </w:r>
+    </w:p>
+    <w:p>
+      <w:pPr>
+        <w:pStyle w:val="ListBullet"/>
+      </w:pPr>
+      <w:r>
+        <w:t>down/terminal/balance/ground/knee/strike는 전부 a-vs-b 부호 있는 제로섬 항목인데, 이제 a슬롯(+X)과 b슬롯(-X)이 같은 통계 풀에 들어가 평균 내면 수학적으로 항상 0으로 상쇄됨 — 버그가 아니라 설계상 당연한 결과였지만, 그러면 모니터링 가치가 없어져서 절댓값으로 집계하도록 BreakdownCallback을 수정.</w:t>
+      </w:r>
+    </w:p>
+    <w:p>
+      <w:pPr>
         <w:pStyle w:val="Heading1"/>
       </w:pPr>
       <w:r>
@@ -521,6 +572,84 @@
     <w:p>
       <w:r>
         <w:rPr>
+          <w:b/>
+        </w:rPr>
+        <w:t>13. 미러 증강 (A_MIRROR_AUGMENT_PROB=0.5)</w:t>
+      </w:r>
+    </w:p>
+    <w:p>
+      <w:r>
+        <w:t>self-play 매치에서 'a'가 60~97%의 확률로 자기 붕괴하며 넘어지는 반면 'b'는 거의 그러지 않는(예: 57:3) 극단적 비대칭을 발견. 좌우 위치를 서로 바꿔도, MuJoCo 컴파일 시 body 순서를 바꿔도, a/b를 완전히 같은 코드 경로로 호출해도 결과가 똑같아서 물리/코드 버그가 아니라 '신경망이 자기 자신의 미러 변환 결과에 대해 실제로는 동등하게 행동하지 않는다'는 결론에 도달. 원인은 'a'만 그래디언트로 학습되고 'b'는 얼려진 스냅샷이라, 미러링된 관측 프레임이 한 번도 직접 최적화된 적이 없어서였다. 'a' 자신도 무작위로 절반의 에피소드는 미러 프레임으로 플레이하게 강제해 그 프레임에도 직접 그래디언트가 흐르게 함.</w:t>
+      </w:r>
+    </w:p>
+    <w:p>
+      <w:r>
+        <w:rPr>
+          <w:b/>
+        </w:rPr>
+        <w:t>14. balance 페널티 (BALANCE_FREE_ZONE / BALANCE_PENALTY_SCALE)</w:t>
+      </w:r>
+    </w:p>
+    <w:p>
+      <w:r>
+        <w:t>낙상 관련 항목(down/knockdown_entry)이 전부 '이미 넘어진 뒤' 사후 페널티라, 균형 유지에 대한 조밀하고 즉각적인 신호가 없었다. root_ry(몸통 기울기) 자체에 페널티를 걸되, 평소 흔들림(~0.02-0.03 rad)까지 벌점화하면 EFFORT_COST와 같은 함정(늘 존재하는 잡음에 벌점을 줘서 실제 위험 신호가 묻힘)에 빠지므로, 측정으로 확인한 free zone(0.15 rad) 밖으로 벗어난 '위험한' 기울어짐에만 제곱으로 세게 벌점을 주도록 설계.</w:t>
+      </w:r>
+    </w:p>
+    <w:p>
+      <w:r>
+        <w:rPr>
+          <w:b/>
+        </w:rPr>
+        <w:t>15. 발 접지 보상 / 무릎 착지 페널티 (GROUND_CONTACT_SCALE / KNEE_CONTACT_PENALTY)</w:t>
+      </w:r>
+    </w:p>
+    <w:p>
+      <w:r>
+        <w:t>실제 격투가가 안정성을 위해 발을 땅에 붙이고 서 있는 것과 같은 원리로, 발이 지면에 닿아 있는 시간에 비례해 보상하고, 무릎이 지면에 닿으면(다리가 무너지는 신호) 세게 벌점을 주는 항목을 추가. 새 geom 없이, shin 캡슐이 지면과 접촉한 지점이 무릎 쪽(shin 몸체 자신의 원점)에 가까운지 발 쪽(foot site)에 가까운지로 두 상황을 구분해 구현.</w:t>
+      </w:r>
+    </w:p>
+    <w:p>
+      <w:r>
+        <w:rPr>
+          <w:b/>
+        </w:rPr>
+        <w:t>16. '처음부터 학습' 대조 실험</w:t>
+      </w:r>
+    </w:p>
+    <w:p>
+      <w:r>
+        <w:t>오래 학습해 굳어진 나쁜 습관 때문에 비대칭이 생긴 게 아닌가 하는 가설을 검증하기 위해, 예전 체인의 가중치를 전혀 안 섞고 랜덤 초기화부터(train.py, --resume-from 없이) 완전히 새로 학습한 뒤 셀프플레이에 투입. 결과: 똑같은 비대칭이 1라운드부터 재현됨 (52~53:7 수준). 이로써 '오래된 습관 탓'이라는 가설은 폐기되고, 원인이 self-play 구조 자체에 있다는 확신이 커짐 — 다만 이후 진짜 원인은 '얼려진 상대'보다 더 근본적임이 17번 항목에서 드러난다.</w:t>
+      </w:r>
+    </w:p>
+    <w:p>
+      <w:r>
+        <w:rPr>
+          <w:b/>
+        </w:rPr>
+        <w:t>17. 진짜 동시 셀프플레이 (paired self-play, 2.10절 참고)</w:t>
+      </w:r>
+    </w:p>
+    <w:p>
+      <w:r>
+        <w:t>'a'만 학습하고 'b'는 얼려지는 구조 자체를 없애고, 두 시점 다 같은 살아있는 정책이 동시에 플레이하며 둘 다 그래디언트를 받도록 아키텍처를 새로 구현. 도입 초반(수백만 스텝)엔 비율이 47:13(78:22)까지 개선되는 것처럼 보였으나, std가 0.044까지 완전히 수렴할 때까지(2억 스텝 이상) 학습을 더 진행하자 55:5(92:8)로 원래의 나쁜 비율로 되돌아왔다. 즉 초반의 개선은 수렴 과정의 일시적 현상이었지, 안정된 해결이 아니었다.</w:t>
+      </w:r>
+    </w:p>
+    <w:p>
+      <w:r>
+        <w:rPr>
+          <w:b/>
+        </w:rPr>
+        <w:t>18. 결론: 자발적 대칭 깨짐 (spontaneous symmetry breaking)</w:t>
+      </w:r>
+    </w:p>
+    <w:p>
+      <w:r>
+        <w:t>환경/물리는 완벽히 대칭이지만, 이를 학습하는 신경망은 '원본 상태에 대한 반응'과 '미러링된 상태에 대한 반응'이 서로 미러 관계여야 한다는 제약을 전혀 받지 않는다. 랜덤 초기화의 미세한 비대칭이 on-policy 학습의 자기강화 루프(한쪽에서 살짝 더 잘하면 그 방향의 경험이 더 쌓이고, 그 방향만 더 다듬어짐)를 통해 점점 굳어지는 것으로 보인다 — 물리학의 자발적 대칭 깨짐과 유사한 현상. 데이터가 대칭이어도 결과가 대칭이라는 보장은 없으며, 이를 실제로 강제하려면 지금까지 시도한 것(대칭적인 학습 기회 제공)보다 한 단계 더 들어간, 결과 자체에 대칭을 강제하는 명시적 메커니즘(예: 미러 입력에 대한 출력 차이를 직접 벌점화하는 정규화 손실)이 필요할 것으로 보인다. 세션 종료 시점 기준 미해결.</w:t>
+      </w:r>
+    </w:p>
+    <w:p>
+      <w:r>
+        <w:rPr>
           <w:b w:val="0"/>
           <w:i/>
         </w:rPr>
@@ -532,7 +661,352 @@
         <w:pStyle w:val="Heading1"/>
       </w:pPr>
       <w:r>
-        <w:t>4. 진단 스크립트</w:t>
+        <w:t>4. Self-play a/b 비대칭 심층 조사</w:t>
+      </w:r>
+    </w:p>
+    <w:p>
+      <w:r>
+        <w:rPr>
+          <w:b w:val="0"/>
+          <w:i w:val="0"/>
+        </w:rPr>
+        <w:t>미러 self-play 매치에서 'a'가 압도적으로 더 자주 넘어지는 현상(예: 60판 중 52~58판)을 코드 버그로 의심하고 체계적으로 소거법 조사를 진행했다. 매번 40~60 에피소드 기준으로 재현되는지 직접 측정했다:</w:t>
+      </w:r>
+    </w:p>
+    <w:tbl>
+      <w:tblPr>
+        <w:tblStyle w:val="LightGrid-Accent1"/>
+        <w:tblW w:type="auto" w:w="0"/>
+        <w:tblLook w:firstColumn="1" w:firstRow="1" w:lastColumn="0" w:lastRow="0" w:noHBand="0" w:noVBand="1" w:val="04A0"/>
+      </w:tblPr>
+      <w:tblGrid>
+        <w:gridCol w:w="2880"/>
+        <w:gridCol w:w="2880"/>
+        <w:gridCol w:w="2880"/>
+      </w:tblGrid>
+      <w:tr>
+        <w:tc>
+          <w:tcPr>
+            <w:tcW w:type="dxa" w:w="2880"/>
+          </w:tcPr>
+          <w:p>
+            <w:r>
+              <w:rPr>
+                <w:b/>
+              </w:rPr>
+              <w:t>가설</w:t>
+            </w:r>
+          </w:p>
+        </w:tc>
+        <w:tc>
+          <w:tcPr>
+            <w:tcW w:type="dxa" w:w="2880"/>
+          </w:tcPr>
+          <w:p>
+            <w:r>
+              <w:rPr>
+                <w:b/>
+              </w:rPr>
+              <w:t>테스트 방법</w:t>
+            </w:r>
+          </w:p>
+        </w:tc>
+        <w:tc>
+          <w:tcPr>
+            <w:tcW w:type="dxa" w:w="2880"/>
+          </w:tcPr>
+          <w:p>
+            <w:r>
+              <w:rPr>
+                <w:b/>
+              </w:rPr>
+              <w:t>결과</w:t>
+            </w:r>
+          </w:p>
+        </w:tc>
+      </w:tr>
+      <w:tr>
+        <w:tc>
+          <w:tcPr>
+            <w:tcW w:type="dxa" w:w="2880"/>
+          </w:tcPr>
+          <w:p>
+            <w:r>
+              <w:t>deterministic vs stochastic 액션 차이</w:t>
+            </w:r>
+          </w:p>
+        </w:tc>
+        <w:tc>
+          <w:tcPr>
+            <w:tcW w:type="dxa" w:w="2880"/>
+          </w:tcPr>
+          <w:p>
+            <w:r>
+              <w:t>양쪽 다 stochastic으로 통일</w:t>
+            </w:r>
+          </w:p>
+        </w:tc>
+        <w:tc>
+          <w:tcPr>
+            <w:tcW w:type="dxa" w:w="2880"/>
+          </w:tcPr>
+          <w:p>
+            <w:r>
+              <w:t>동일하게 재현 (기각)</w:t>
+            </w:r>
+          </w:p>
+        </w:tc>
+      </w:tr>
+      <w:tr>
+        <w:tc>
+          <w:tcPr>
+            <w:tcW w:type="dxa" w:w="2880"/>
+          </w:tcPr>
+          <w:p>
+            <w:r>
+              <w:t>특정 체크포인트의 우연</w:t>
+            </w:r>
+          </w:p>
+        </w:tc>
+        <w:tc>
+          <w:tcPr>
+            <w:tcW w:type="dxa" w:w="2880"/>
+          </w:tcPr>
+          <w:p>
+            <w:r>
+              <w:t>훨씬 이전 체크포인트로 재시도</w:t>
+            </w:r>
+          </w:p>
+        </w:tc>
+        <w:tc>
+          <w:tcPr>
+            <w:tcW w:type="dxa" w:w="2880"/>
+          </w:tcPr>
+          <w:p>
+            <w:r>
+              <w:t>동일하게 재현 (기각)</w:t>
+            </w:r>
+          </w:p>
+        </w:tc>
+      </w:tr>
+      <w:tr>
+        <w:tc>
+          <w:tcPr>
+            <w:tcW w:type="dxa" w:w="2880"/>
+          </w:tcPr>
+          <w:p>
+            <w:r>
+              <w:t>물리적 좌우 위치(-0.9/+0.9)</w:t>
+            </w:r>
+          </w:p>
+        </w:tc>
+        <w:tc>
+          <w:tcPr>
+            <w:tcW w:type="dxa" w:w="2880"/>
+          </w:tcPr>
+          <w:p>
+            <w:r>
+              <w:t>위치를 서로 바꿔서 재시도</w:t>
+            </w:r>
+          </w:p>
+        </w:tc>
+        <w:tc>
+          <w:tcPr>
+            <w:tcW w:type="dxa" w:w="2880"/>
+          </w:tcPr>
+          <w:p>
+            <w:r>
+              <w:t>동일하게 재현 (기각)</w:t>
+            </w:r>
+          </w:p>
+        </w:tc>
+      </w:tr>
+      <w:tr>
+        <w:tc>
+          <w:tcPr>
+            <w:tcW w:type="dxa" w:w="2880"/>
+          </w:tcPr>
+          <w:p>
+            <w:r>
+              <w:t>MuJoCo 컴파일 시 body/geom 인덱스 순서</w:t>
+            </w:r>
+          </w:p>
+        </w:tc>
+        <w:tc>
+          <w:tcPr>
+            <w:tcW w:type="dxa" w:w="2880"/>
+          </w:tcPr>
+          <w:p>
+            <w:r>
+              <w:t>XML 선언 순서를 바꿔서 재시도</w:t>
+            </w:r>
+          </w:p>
+        </w:tc>
+        <w:tc>
+          <w:tcPr>
+            <w:tcW w:type="dxa" w:w="2880"/>
+          </w:tcPr>
+          <w:p>
+            <w:r>
+              <w:t>동일하게 재현 (기각)</w:t>
+            </w:r>
+          </w:p>
+        </w:tc>
+      </w:tr>
+      <w:tr>
+        <w:tc>
+          <w:tcPr>
+            <w:tcW w:type="dxa" w:w="2880"/>
+          </w:tcPr>
+          <w:p>
+            <w:r>
+              <w:t>두 정책 객체가 실제로 같은 가중치인지</w:t>
+            </w:r>
+          </w:p>
+        </w:tc>
+        <w:tc>
+          <w:tcPr>
+            <w:tcW w:type="dxa" w:w="2880"/>
+          </w:tcPr>
+          <w:p>
+            <w:r>
+              <w:t>torch.equal로 직접 비교</w:t>
+            </w:r>
+          </w:p>
+        </w:tc>
+        <w:tc>
+          <w:tcPr>
+            <w:tcW w:type="dxa" w:w="2880"/>
+          </w:tcPr>
+          <w:p>
+            <w:r>
+              <w:t>완전히 동일 (기각)</w:t>
+            </w:r>
+          </w:p>
+        </w:tc>
+      </w:tr>
+      <w:tr>
+        <w:tc>
+          <w:tcPr>
+            <w:tcW w:type="dxa" w:w="2880"/>
+          </w:tcPr>
+          <w:p>
+            <w:r>
+              <w:t>외부 predict() vs 내부 opponent_policy 호출 구조</w:t>
+            </w:r>
+          </w:p>
+        </w:tc>
+        <w:tc>
+          <w:tcPr>
+            <w:tcW w:type="dxa" w:w="2880"/>
+          </w:tcPr>
+          <w:p>
+            <w:r>
+              <w:t>a/b를 완전히 같은 호출 방식으로 통일</w:t>
+            </w:r>
+          </w:p>
+        </w:tc>
+        <w:tc>
+          <w:tcPr>
+            <w:tcW w:type="dxa" w:w="2880"/>
+          </w:tcPr>
+          <w:p>
+            <w:r>
+              <w:t>동일하게 재현 (기각)</w:t>
+            </w:r>
+          </w:p>
+        </w:tc>
+      </w:tr>
+      <w:tr>
+        <w:tc>
+          <w:tcPr>
+            <w:tcW w:type="dxa" w:w="2880"/>
+          </w:tcPr>
+          <w:p>
+            <w:r>
+              <w:t>오래 학습해 굳어진 습관</w:t>
+            </w:r>
+          </w:p>
+        </w:tc>
+        <w:tc>
+          <w:tcPr>
+            <w:tcW w:type="dxa" w:w="2880"/>
+          </w:tcPr>
+          <w:p>
+            <w:r>
+              <w:t>랜덤 초기화부터 완전히 새로 학습</w:t>
+            </w:r>
+          </w:p>
+        </w:tc>
+        <w:tc>
+          <w:tcPr>
+            <w:tcW w:type="dxa" w:w="2880"/>
+          </w:tcPr>
+          <w:p>
+            <w:r>
+              <w:t>1라운드부터 동일하게 재현 (기각)</w:t>
+            </w:r>
+          </w:p>
+        </w:tc>
+      </w:tr>
+      <w:tr>
+        <w:tc>
+          <w:tcPr>
+            <w:tcW w:type="dxa" w:w="2880"/>
+          </w:tcPr>
+          <w:p>
+            <w:r>
+              <w:t>얼려진 상대(frozen opponent) 구조 자체</w:t>
+            </w:r>
+          </w:p>
+        </w:tc>
+        <w:tc>
+          <w:tcPr>
+            <w:tcW w:type="dxa" w:w="2880"/>
+          </w:tcPr>
+          <w:p>
+            <w:r>
+              <w:t>paired self-play로 전면 재구현</w:t>
+            </w:r>
+          </w:p>
+        </w:tc>
+        <w:tc>
+          <w:tcPr>
+            <w:tcW w:type="dxa" w:w="2880"/>
+          </w:tcPr>
+          <w:p>
+            <w:r>
+              <w:t>초반 개선 후 장기 수렴 시 재발 (부분 기각)</w:t>
+            </w:r>
+          </w:p>
+        </w:tc>
+      </w:tr>
+    </w:tbl>
+    <w:p/>
+    <w:p>
+      <w:r>
+        <w:rPr>
+          <w:b w:val="0"/>
+          <w:i w:val="0"/>
+        </w:rPr>
+        <w:t>마지막까지 남은 설명은 4절 하단(리워드 히스토리 18번 항목)의 '자발적 대칭 깨짐'이다: 환경은 대칭이지만 신경망이 그 대칭을 지킬 필요가 없어서, on-policy 학습의 자기강화 루프를 통해 비대칭이 스스로 굳어진다는 결론이다.</w:t>
+      </w:r>
+    </w:p>
+    <w:p>
+      <w:r>
+        <w:rPr>
+          <w:b w:val="0"/>
+          <w:i w:val="0"/>
+        </w:rPr>
+        <w:t>이 조사와 별개로, '지금 KO가 왜 이렇게 안 나오나'라는 질문에서 출발한 진단도 있었다: 60판 기준 실제 KO(체력 0)는 0판, 종료 시 평균 체력은 92~99/100로 거의 안 닳아 있었고, 에피소드 길이는 평균 240~270스텝으로 MAX_STEPS(1000)의 27% 정도만 쓰고 낙상으로 끝났다. 즉 KO가 적은 건 'KO에 대한 보상이 약해서'가 아니라 '데미지가 쌓일 시간 자체가 자기 붕괴 때문에 부족해서'로 진단됨 — 여기서도 리워드를 더 세게 주는 것보다 자기 붕괴 문제 해결이 우선이라는 결론.</w:t>
+      </w:r>
+    </w:p>
+    <w:p>
+      <w:pPr>
+        <w:pStyle w:val="Heading1"/>
+      </w:pPr>
+      <w:r>
+        <w:t>5. 진단 스크립트</w:t>
       </w:r>
     </w:p>
     <w:tbl>
@@ -619,6 +1093,38 @@
           </w:p>
         </w:tc>
       </w:tr>
+      <w:tr>
+        <w:tc>
+          <w:tcPr>
+            <w:tcW w:type="dxa" w:w="2880"/>
+          </w:tcPr>
+          <w:p>
+            <w:r>
+              <w:t>scripts/diag_engage.py</w:t>
+            </w:r>
+          </w:p>
+        </w:tc>
+        <w:tc>
+          <w:tcPr>
+            <w:tcW w:type="dxa" w:w="2880"/>
+          </w:tcPr>
+          <w:p>
+            <w:r>
+              <w:t>미러 매치에서 에피소드 종료 사유(a/b 다운타임아웃, KO, mutual fall 등) 집계, foot_dist 기준 실제 근접 여부까지 함께 측정</w:t>
+            </w:r>
+          </w:p>
+        </w:tc>
+        <w:tc>
+          <w:tcPr>
+            <w:tcW w:type="dxa" w:w="2880"/>
+          </w:tcPr>
+          <w:p>
+            <w:r>
+              <w:t>a:b 다운타임아웃 비율이 세션 내내 반복 측정된 핵심 지표 (예: 56:4, 47:13 등)</w:t>
+            </w:r>
+          </w:p>
+        </w:tc>
+      </w:tr>
     </w:tbl>
     <w:p/>
     <w:p>
@@ -627,7 +1133,7 @@
           <w:b w:val="0"/>
           <w:i w:val="0"/>
         </w:rPr>
-        <w:t>이전 세션에서 자세 히스토그램, 접촉력 분포, 넉다운 횟수, mean|action| 측정 등 다수의 1회성 진단 스크립트를가 실행됐으나 파일로 저장되지 않았다 (필요 시 재작성 용이 — 모두 체크포인트 로드 후 N 스텝 돌리며 env.data/info를 직접 샘플링하는 동일한 패턴).</w:t>
+        <w:t>이전 세션에서 자세 히스토그램, 접촉력 분포, 넉다운 횟수, mean|action|, root_ry 분포, 발-지면 접촉 비율, KO/체력 종료값 측정 등 다수의 1회성 진단 스크립트가 실행됐으나 전부 파일로 저장된 건 아니다 (필요 시 재작성 용이 — 모두 체크포인트 로드 후 N 스텝 돌리며 env.data/info를 직접 샘플링하는 동일한 패턴).</w:t>
       </w:r>
     </w:p>
     <w:p>
@@ -635,7 +1141,7 @@
         <w:pStyle w:val="Heading1"/>
       </w:pPr>
       <w:r>
-        <w:t>5. 현재 상수 값 (scripts/env.py)</w:t>
+        <w:t>6. 현재 상수 값 (scripts/env.py)</w:t>
       </w:r>
     </w:p>
     <w:tbl>
@@ -1490,6 +1996,166 @@
           </w:p>
         </w:tc>
       </w:tr>
+      <w:tr>
+        <w:tc>
+          <w:tcPr>
+            <w:tcW w:type="dxa" w:w="2880"/>
+          </w:tcPr>
+          <w:p>
+            <w:r>
+              <w:t>A_MIRROR_AUGMENT_PROB</w:t>
+            </w:r>
+          </w:p>
+        </w:tc>
+        <w:tc>
+          <w:tcPr>
+            <w:tcW w:type="dxa" w:w="2880"/>
+          </w:tcPr>
+          <w:p>
+            <w:r>
+              <w:t>0.5</w:t>
+            </w:r>
+          </w:p>
+        </w:tc>
+        <w:tc>
+          <w:tcPr>
+            <w:tcW w:type="dxa" w:w="2880"/>
+          </w:tcPr>
+          <w:p>
+            <w:r>
+              <w:t>'a' 자신을 미러 프레임으로 플레이시키는 에피소드 비율</w:t>
+            </w:r>
+          </w:p>
+        </w:tc>
+      </w:tr>
+      <w:tr>
+        <w:tc>
+          <w:tcPr>
+            <w:tcW w:type="dxa" w:w="2880"/>
+          </w:tcPr>
+          <w:p>
+            <w:r>
+              <w:t>BALANCE_FREE_ZONE</w:t>
+            </w:r>
+          </w:p>
+        </w:tc>
+        <w:tc>
+          <w:tcPr>
+            <w:tcW w:type="dxa" w:w="2880"/>
+          </w:tcPr>
+          <w:p>
+            <w:r>
+              <w:t>0.15 rad (~8.6도)</w:t>
+            </w:r>
+          </w:p>
+        </w:tc>
+        <w:tc>
+          <w:tcPr>
+            <w:tcW w:type="dxa" w:w="2880"/>
+          </w:tcPr>
+          <w:p>
+            <w:r>
+              <w:t>이 각도까지는 root_ry 기울기 페널티 없음</w:t>
+            </w:r>
+          </w:p>
+        </w:tc>
+      </w:tr>
+      <w:tr>
+        <w:tc>
+          <w:tcPr>
+            <w:tcW w:type="dxa" w:w="2880"/>
+          </w:tcPr>
+          <w:p>
+            <w:r>
+              <w:t>BALANCE_PENALTY_SCALE</w:t>
+            </w:r>
+          </w:p>
+        </w:tc>
+        <w:tc>
+          <w:tcPr>
+            <w:tcW w:type="dxa" w:w="2880"/>
+          </w:tcPr>
+          <w:p>
+            <w:r>
+              <w:t>100.0</w:t>
+            </w:r>
+          </w:p>
+        </w:tc>
+        <w:tc>
+          <w:tcPr>
+            <w:tcW w:type="dxa" w:w="2880"/>
+          </w:tcPr>
+          <w:p>
+            <w:r>
+              <w:t>free zone 밖 기울기에 대한 제곱 페널티 계수</w:t>
+            </w:r>
+          </w:p>
+        </w:tc>
+      </w:tr>
+      <w:tr>
+        <w:tc>
+          <w:tcPr>
+            <w:tcW w:type="dxa" w:w="2880"/>
+          </w:tcPr>
+          <w:p>
+            <w:r>
+              <w:t>GROUND_CONTACT_SCALE</w:t>
+            </w:r>
+          </w:p>
+        </w:tc>
+        <w:tc>
+          <w:tcPr>
+            <w:tcW w:type="dxa" w:w="2880"/>
+          </w:tcPr>
+          <w:p>
+            <w:r>
+              <w:t>1.0</w:t>
+            </w:r>
+          </w:p>
+        </w:tc>
+        <w:tc>
+          <w:tcPr>
+            <w:tcW w:type="dxa" w:w="2880"/>
+          </w:tcPr>
+          <w:p>
+            <w:r>
+              <w:t>발 접지 개수(0/0.5/1.0)에 비례한 보상 계수</w:t>
+            </w:r>
+          </w:p>
+        </w:tc>
+      </w:tr>
+      <w:tr>
+        <w:tc>
+          <w:tcPr>
+            <w:tcW w:type="dxa" w:w="2880"/>
+          </w:tcPr>
+          <w:p>
+            <w:r>
+              <w:t>KNEE_CONTACT_PENALTY</w:t>
+            </w:r>
+          </w:p>
+        </w:tc>
+        <w:tc>
+          <w:tcPr>
+            <w:tcW w:type="dxa" w:w="2880"/>
+          </w:tcPr>
+          <w:p>
+            <w:r>
+              <w:t>15.0</w:t>
+            </w:r>
+          </w:p>
+        </w:tc>
+        <w:tc>
+          <w:tcPr>
+            <w:tcW w:type="dxa" w:w="2880"/>
+          </w:tcPr>
+          <w:p>
+            <w:r>
+              <w:t>무릎이 지면에 닿을 때 스텝당 페널티</w:t>
+            </w:r>
+          </w:p>
+        </w:tc>
+      </w:tr>
     </w:tbl>
     <w:p/>
     <w:p>
@@ -1497,7 +2163,7 @@
         <w:pStyle w:val="Heading1"/>
       </w:pPr>
       <w:r>
-        <w:t>6. 알려진 이슈 / 미해결 과제</w:t>
+        <w:t>7. 알려진 이슈 / 미해결 과제</w:t>
       </w:r>
     </w:p>
     <w:p>
@@ -1505,7 +2171,23 @@
         <w:pStyle w:val="ListBullet"/>
       </w:pPr>
       <w:r>
-        <w:t>자기 붕괴(self-destabilization): 상대 접촉 없이 스스로 넘어지는 비율이 여전히 높다 (밸런스 보조 도입 후에도 낙상의 약 94.9%가 자기 유발). jerk/effort/entropy 등 5개 리워드 레버를 시도했지만 전부 효과 없었고, PD 밸런스 보조(물리적 해법)가 현재의 실질적 한계로 합의됨.</w:t>
+        <w:t>(최우선, 미해결) 자발적 대칭 깨짐: self-play에서 'a'가 압도적으로 더 자주 넘어지는 비대칭이, 미러 증강·balance 페널티·ground/knee 보상·진짜 동시 셀프플레이(paired) 아키텍처 전면 재구현까지 거쳤음에도 장기 수렴 후엔 항상 원래 수준(약 90~97:3~10)으로 되돌아온다. 8개 가설을 소거법으로 검증해 코드/물리 버그가 아님을 확인했고(4절), 현재로선 '환경은 대칭이지만 신경망이 그 대칭을 지킬 필요가 없어서 on-policy 학습이 자기강화적으로 비대칭을 굳힌다'는 설명이 유력하다. 진짜 해결에는 결과 자체에 대칭을 명시적으로 강제하는 메커니즘(정규화 손실 등)이 필요해 보이나 아직 시도하지 않음.</w:t>
+      </w:r>
+    </w:p>
+    <w:p>
+      <w:pPr>
+        <w:pStyle w:val="ListBullet"/>
+      </w:pPr>
+      <w:r>
+        <w:t>자기 붕괴(self-destabilization) 자체: 상대 접촉 없이 스스로 넘어지는 비율이 여전히 높다. PD 밸런스 보조(물리적 해법)가 큰 도움이 됐지만 완전히 해결하진 못했고, ground/knee/balance 리워드도 뚜렷한 장기 개선을 보여주지 못했다 (위 항목과 사실상 같은 문제의 다른 단면).</w:t>
+      </w:r>
+    </w:p>
+    <w:p>
+      <w:pPr>
+        <w:pStyle w:val="ListBullet"/>
+      </w:pPr>
+      <w:r>
+        <w:t>KO가 거의 발생하지 않음(측정: 60판 중 0판): 진단 결과 원인은 데미지 보상 부족이 아니라 자기 붕괴로 인한 조기 종료 — 위 두 항목이 해결되면 자연히 나아질 가능성이 높다는 게 현재 가설, 아직 검증 전.</w:t>
       </w:r>
     </w:p>
     <w:p>
@@ -1529,7 +2211,7 @@
         <w:pStyle w:val="ListBullet"/>
       </w:pPr>
       <w:r>
-        <w:t>다리(hip/knee) 관절에는 팔과 같은 힘-각도 커브가 아직 없음 — 킥의 회전형 타격이 리워드에 반영되는 것은 이제 접촉력 재조정으로 확인됐지만(4절), 다리 자체의 근력 커브 적용 여부는 논의만 되고 미결정 상태.</w:t>
+        <w:t>다리(hip/knee) 관절에는 팔과 같은 힘-각도 커브가 아직 없음 — 킥의 회전형 타격이 리워드에 반영되는 것은 이제 접촉력 재조정으로 확인됐지만(5절), 다리 자체의 근력 커브 적용 여부는 논의만 되고 미결정 상태.</w:t>
       </w:r>
     </w:p>
     <w:p>
@@ -1545,7 +2227,7 @@
         <w:pStyle w:val="Heading1"/>
       </w:pPr>
       <w:r>
-        <w:t>7. 참고: 탐색했다가 되돌린 방향</w:t>
+        <w:t>8. 참고: 탐색했다가 되돌린 방향</w:t>
       </w:r>
     </w:p>
     <w:p>

</xml_diff>